<commit_message>
Phase 1: Core pywin32 migration complete (TemplateRenderer + Integration + Threading)
</commit_message>
<xml_diff>
--- a/examples/Project_Sample/Output/template_manual-Le Van C_HD003.docx
+++ b/examples/Project_Sample/Output/template_manual-Le Van C_HD003.docx
@@ -8,18 +8,46 @@
       </w:r>
     </w:p>
     <w:p>
+      <w:pPr>
+        <w:rPr>
+          <w:b/>
+          <w:bCs/>
+        </w:rPr>
+      </w:pPr>
       <w:r>
-        <w:t xml:space="preserve">Số hợp đồng: HD003</w:t>
+        <w:rPr>
+          <w:b/>
+          <w:bCs/>
+        </w:rPr>
+        <w:t>Số hợp đồng: &lt;&lt;SoHD&gt;&gt;</w:t>
       </w:r>
     </w:p>
     <w:p>
+      <w:pPr>
+        <w:rPr>
+          <w:i/>
+          <w:iCs/>
+        </w:rPr>
+      </w:pPr>
       <w:r>
-        <w:t xml:space="preserve">Họ tên: Le Van C</w:t>
+        <w:rPr>
+          <w:i/>
+          <w:iCs/>
+        </w:rPr>
+        <w:t>Họ tên: &lt;&lt;HoTen&gt;&gt;</w:t>
       </w:r>
     </w:p>
     <w:p>
+      <w:pPr>
+        <w:rPr>
+          <w:u w:val="single"/>
+        </w:rPr>
+      </w:pPr>
       <w:r>
-        <w:t xml:space="preserve">Địa chỉ: Da Nang</w:t>
+        <w:rPr>
+          <w:u w:val="single"/>
+        </w:rPr>
+        <w:t>Địa chỉ: &lt;&lt;DiaChi&gt;&gt;</w:t>
       </w:r>
     </w:p>
     <w:p/>

</xml_diff>